<commit_message>
Popraw uklad i podpisy formularza D-01
</commit_message>
<xml_diff>
--- a/public/wzory/CIS_D-01_Karta_kursu_zawodowego_uczestnika.docx
+++ b/public/wzory/CIS_D-01_Karta_kursu_zawodowego_uczestnika.docx
@@ -98,6 +98,7 @@
           <w:insideH w:val="single" w:color="auto" w:sz="4"/>
           <w:insideV w:val="single" w:color="auto" w:sz="4"/>
         </w:tblBorders>
+        <w:tblLayout w:type="fixed"/>
       </w:tblPr>
       <w:tblGrid>
         <w:gridCol w:w="3300"/>
@@ -246,8 +247,9 @@
     </w:tbl>
     <w:p>
       <w:pPr>
-        <w:spacing w:after="100"/>
+        <w:spacing w:after="100" w:before="200"/>
         <w:jc w:val="left"/>
+        <w:keepNext/>
       </w:pPr>
       <w:r>
         <w:rPr>
@@ -323,6 +325,7 @@
           <w:insideH w:val="single" w:color="auto" w:sz="4"/>
           <w:insideV w:val="single" w:color="auto" w:sz="4"/>
         </w:tblBorders>
+        <w:tblLayout w:type="fixed"/>
       </w:tblPr>
       <w:tblGrid>
         <w:gridCol w:w="4536"/>
@@ -415,7 +418,7 @@
                 <w:sz w:val="16"/>
                 <w:szCs w:val="16"/>
               </w:rPr>
-              <w:t xml:space="preserve">data i podpis koordynatora</w:t>
+              <w:t xml:space="preserve">data i podpis Kierownika CIS</w:t>
             </w:r>
           </w:p>
         </w:tc>
@@ -423,8 +426,9 @@
     </w:tbl>
     <w:p>
       <w:pPr>
-        <w:spacing w:after="100"/>
+        <w:spacing w:after="100" w:before="200"/>
         <w:jc w:val="left"/>
+        <w:keepNext/>
       </w:pPr>
       <w:r>
         <w:rPr>
@@ -483,6 +487,7 @@
           <w:insideH w:val="single" w:color="auto" w:sz="4"/>
           <w:insideV w:val="single" w:color="auto" w:sz="4"/>
         </w:tblBorders>
+        <w:tblLayout w:type="fixed"/>
       </w:tblPr>
       <w:tblGrid>
         <w:gridCol w:w="4536"/>
@@ -583,8 +588,9 @@
     </w:tbl>
     <w:p>
       <w:pPr>
-        <w:spacing w:after="100"/>
+        <w:spacing w:after="100" w:before="200"/>
         <w:jc w:val="left"/>
+        <w:keepNext/>
       </w:pPr>
       <w:r>
         <w:rPr>
@@ -609,6 +615,7 @@
           <w:insideH w:val="single" w:color="auto" w:sz="4"/>
           <w:insideV w:val="single" w:color="auto" w:sz="4"/>
         </w:tblBorders>
+        <w:tblLayout w:type="fixed"/>
       </w:tblPr>
       <w:tblGrid>
         <w:gridCol w:w="2900"/>
@@ -1330,8 +1337,9 @@
     </w:p>
     <w:p>
       <w:pPr>
-        <w:spacing w:after="100"/>
+        <w:spacing w:after="100" w:before="200"/>
         <w:jc w:val="left"/>
+        <w:keepNext/>
       </w:pPr>
       <w:r>
         <w:rPr>
@@ -1381,7 +1389,7 @@
     </w:p>
     <w:p>
       <w:pPr>
-        <w:spacing w:after="80"/>
+        <w:spacing w:after="200"/>
         <w:jc w:val="left"/>
       </w:pPr>
       <w:r>
@@ -1396,6 +1404,116 @@
         <w:t xml:space="preserve">Kopię certyfikatu włączono do dokumentacji projektu i odnotowano w skoroszycie monitoringu wskaźników (CIS/F-03): ☐ TAK</w:t>
       </w:r>
     </w:p>
+    <w:tbl>
+      <w:tblPr>
+        <w:tblW w:type="dxa" w:w="9072"/>
+        <w:tblBorders>
+          <w:top w:val="single" w:color="auto" w:sz="4"/>
+          <w:left w:val="single" w:color="auto" w:sz="4"/>
+          <w:bottom w:val="single" w:color="auto" w:sz="4"/>
+          <w:right w:val="single" w:color="auto" w:sz="4"/>
+          <w:insideH w:val="single" w:color="auto" w:sz="4"/>
+          <w:insideV w:val="single" w:color="auto" w:sz="4"/>
+        </w:tblBorders>
+        <w:tblLayout w:type="fixed"/>
+      </w:tblPr>
+      <w:tblGrid>
+        <w:gridCol w:w="4536"/>
+        <w:gridCol w:w="4536"/>
+      </w:tblGrid>
+      <w:tr>
+        <w:tc>
+          <w:tcPr>
+            <w:tcW w:type="dxa" w:w="4536"/>
+            <w:tcBorders>
+              <w:top w:val="none"/>
+              <w:left w:val="none"/>
+              <w:bottom w:val="none"/>
+              <w:right w:val="none"/>
+            </w:tcBorders>
+          </w:tcPr>
+          <w:p>
+            <w:pPr>
+              <w:spacing w:after="0" w:before="360"/>
+              <w:jc w:val="center"/>
+            </w:pPr>
+            <w:r>
+              <w:rPr>
+                <w:b w:val="false"/>
+                <w:bCs w:val="false"/>
+                <w:i w:val="false"/>
+                <w:iCs w:val="false"/>
+                <w:sz w:val="20"/>
+                <w:szCs w:val="20"/>
+              </w:rPr>
+              <w:t xml:space="preserve"/>
+            </w:r>
+          </w:p>
+          <w:p>
+            <w:pPr>
+              <w:spacing w:after="0"/>
+              <w:jc w:val="center"/>
+            </w:pPr>
+            <w:r>
+              <w:rPr>
+                <w:b w:val="false"/>
+                <w:bCs w:val="false"/>
+                <w:i/>
+                <w:iCs/>
+                <w:sz w:val="16"/>
+                <w:szCs w:val="16"/>
+              </w:rPr>
+              <w:t xml:space="preserve"/>
+            </w:r>
+          </w:p>
+        </w:tc>
+        <w:tc>
+          <w:tcPr>
+            <w:tcW w:type="dxa" w:w="4536"/>
+            <w:tcBorders>
+              <w:top w:val="none"/>
+              <w:left w:val="none"/>
+              <w:bottom w:val="none"/>
+              <w:right w:val="none"/>
+            </w:tcBorders>
+          </w:tcPr>
+          <w:p>
+            <w:pPr>
+              <w:spacing w:after="0" w:before="360"/>
+              <w:jc w:val="center"/>
+            </w:pPr>
+            <w:r>
+              <w:rPr>
+                <w:b w:val="false"/>
+                <w:bCs w:val="false"/>
+                <w:i w:val="false"/>
+                <w:iCs w:val="false"/>
+                <w:sz w:val="20"/>
+                <w:szCs w:val="20"/>
+              </w:rPr>
+              <w:t xml:space="preserve">……………………………………………</w:t>
+            </w:r>
+          </w:p>
+          <w:p>
+            <w:pPr>
+              <w:spacing w:after="0"/>
+              <w:jc w:val="center"/>
+            </w:pPr>
+            <w:r>
+              <w:rPr>
+                <w:b w:val="false"/>
+                <w:bCs w:val="false"/>
+                <w:i/>
+                <w:iCs/>
+                <w:sz w:val="16"/>
+                <w:szCs w:val="16"/>
+              </w:rPr>
+              <w:t xml:space="preserve">data i podpis Kierownika CIS</w:t>
+            </w:r>
+          </w:p>
+        </w:tc>
+      </w:tr>
+    </w:tbl>
     <w:sectPr>
       <w:headerReference w:type="default" r:id="rIdLH1"/>
       <w:footerReference w:type="default" r:id="rIdLH2"/>

</xml_diff>